<commit_message>
Reglas nuevas publicadas en la consola
- El usuario publicó firebase/firestore.rules; se comprobó en la consola que
  las reglas publicadas son las nuevas (noControl, avisos de ADR-010).
- Bitácora 20-04, PENDIENTES y ADR-009 (acciones 4 y 5) actualizados.

Co-Authored-By: Claude Opus 5.5 <noreply@anthropic.com>
</commit_message>
<xml_diff>
--- a/docs/BITACORA.docx
+++ b/docs/BITACORA.docx
@@ -139,7 +139,7 @@
     <w:p>
       <w:pPr>
         <w:shd w:val="clear" w:color="auto" w:fill="F7F5F4"/>
-        <w:divId w:val="1151485758"/>
+        <w:divId w:val="420831889"/>
         <w:rPr>
           <w:rFonts w:ascii="Calibri" w:eastAsia="Times New Roman" w:hAnsi="Calibri" w:cs="Calibri"/>
           <w:color w:val="1F1A1A"/>
@@ -244,7 +244,7 @@
           <w:sz w:val="22"/>
           <w:szCs w:val="22"/>
         </w:rPr>
-        <w:pict w14:anchorId="17E5CC63">
+        <w:pict w14:anchorId="1E4B04E2">
           <v:rect id="_x0000_i1025" style="width:0;height:1.5pt" o:hralign="center" o:hrstd="t" o:hr="t" fillcolor="#a0a0a0" stroked="f"/>
         </w:pict>
       </w:r>
@@ -274,7 +274,7 @@
         <w:rPr>
           <w:rFonts w:ascii="Calibri" w:eastAsia="Times New Roman" w:hAnsi="Calibri" w:cs="Calibri"/>
         </w:rPr>
-        <w:t>20-04. Perfiles de la consola actualizados; reglas nuevas listas para publicar</w:t>
+        <w:t>20-04. Perfiles de la consola actualizados y reglas nuevas publicadas</w:t>
       </w:r>
     </w:p>
     <w:p>
@@ -580,7 +580,16 @@
           <w:sz w:val="22"/>
           <w:szCs w:val="22"/>
         </w:rPr>
-        <w:t xml:space="preserve"> con "No. de control"; </w:t>
+        <w:t xml:space="preserve"> </w:t>
+      </w:r>
+      <w:r>
+        <w:rPr>
+          <w:rFonts w:ascii="Calibri" w:eastAsia="Times New Roman" w:hAnsi="Calibri" w:cs="Calibri"/>
+          <w:color w:val="1F1A1A"/>
+          <w:sz w:val="22"/>
+          <w:szCs w:val="22"/>
+        </w:rPr>
+        <w:t xml:space="preserve">con "No. de control"; </w:t>
       </w:r>
       <w:r>
         <w:rPr>
@@ -770,7 +779,7 @@
           <w:sz w:val="22"/>
           <w:szCs w:val="22"/>
         </w:rPr>
-        <w:t xml:space="preserve"> en el editor de reglas de la consola, idéntico al archivo. </w:t>
+        <w:t xml:space="preserve"> en el editor de reglas de la consola, idéntico al archivo. El sistema de permisos no dejó a Claude presionar "Publish" (cambia la seguridad de la base); la pestaña se recargó y se perdió lo pegado, así que se volvió a pegar y </w:t>
       </w:r>
       <w:r>
         <w:rPr>
@@ -781,16 +790,61 @@
           <w:sz w:val="22"/>
           <w:szCs w:val="22"/>
         </w:rPr>
-        <w:t>No se publicó:</w:t>
-      </w:r>
-      <w:r>
-        <w:rPr>
-          <w:rFonts w:ascii="Calibri" w:eastAsia="Times New Roman" w:hAnsi="Calibri" w:cs="Calibri"/>
-          <w:color w:val="1F1A1A"/>
-          <w:sz w:val="22"/>
-          <w:szCs w:val="22"/>
-        </w:rPr>
-        <w:t xml:space="preserve"> el sistema de permisos no dejó a Claude presionar "Publicar" (cambia la seguridad de la base). Lo publica el usuario.</w:t>
+        <w:t>el usuario lo publicó</w:t>
+      </w:r>
+      <w:r>
+        <w:rPr>
+          <w:rFonts w:ascii="Calibri" w:eastAsia="Times New Roman" w:hAnsi="Calibri" w:cs="Calibri"/>
+          <w:color w:val="1F1A1A"/>
+          <w:sz w:val="22"/>
+          <w:szCs w:val="22"/>
+        </w:rPr>
+        <w:t xml:space="preserve">. Después se recargó la página y se comprobó que las reglas publicadas son las nuevas (238 líneas, con </w:t>
+      </w:r>
+      <w:r>
+        <w:rPr>
+          <w:rStyle w:val="HTMLCode"/>
+        </w:rPr>
+        <w:t>noControl</w:t>
+      </w:r>
+      <w:r>
+        <w:rPr>
+          <w:rFonts w:ascii="Calibri" w:eastAsia="Times New Roman" w:hAnsi="Calibri" w:cs="Calibri"/>
+          <w:color w:val="1F1A1A"/>
+          <w:sz w:val="22"/>
+          <w:szCs w:val="22"/>
+        </w:rPr>
+        <w:t xml:space="preserve"> y </w:t>
+      </w:r>
+      <w:r>
+        <w:rPr>
+          <w:rStyle w:val="HTMLCode"/>
+        </w:rPr>
+        <w:t>avisoValido</w:t>
+      </w:r>
+      <w:r>
+        <w:rPr>
+          <w:rFonts w:ascii="Calibri" w:eastAsia="Times New Roman" w:hAnsi="Calibri" w:cs="Calibri"/>
+          <w:color w:val="1F1A1A"/>
+          <w:sz w:val="22"/>
+          <w:szCs w:val="22"/>
+        </w:rPr>
+        <w:t xml:space="preserve">, sin </w:t>
+      </w:r>
+      <w:r>
+        <w:rPr>
+          <w:rStyle w:val="HTMLCode"/>
+        </w:rPr>
+        <w:t>matricula</w:t>
+      </w:r>
+      <w:r>
+        <w:rPr>
+          <w:rFonts w:ascii="Calibri" w:eastAsia="Times New Roman" w:hAnsi="Calibri" w:cs="Calibri"/>
+          <w:color w:val="1F1A1A"/>
+          <w:sz w:val="22"/>
+          <w:szCs w:val="22"/>
+        </w:rPr>
+        <w:t>).</w:t>
       </w:r>
     </w:p>
     <w:p>
@@ -825,16 +879,7 @@
           <w:sz w:val="22"/>
           <w:szCs w:val="22"/>
         </w:rPr>
-        <w:t xml:space="preserve"> </w:t>
-      </w:r>
-      <w:r>
-        <w:rPr>
-          <w:rFonts w:ascii="Calibri" w:eastAsia="Times New Roman" w:hAnsi="Calibri" w:cs="Calibri"/>
-          <w:color w:val="1F1A1A"/>
-          <w:sz w:val="22"/>
-          <w:szCs w:val="22"/>
-        </w:rPr>
-        <w:t xml:space="preserve">al editar </w:t>
+        <w:t xml:space="preserve"> al editar </w:t>
       </w:r>
       <w:r>
         <w:rPr>
@@ -979,7 +1024,16 @@
           <w:sz w:val="22"/>
           <w:szCs w:val="22"/>
         </w:rPr>
-        <w:t xml:space="preserve"> en la consola después de guardarlo y coincide con </w:t>
+        <w:t xml:space="preserve"> </w:t>
+      </w:r>
+      <w:r>
+        <w:rPr>
+          <w:rFonts w:ascii="Calibri" w:eastAsia="Times New Roman" w:hAnsi="Calibri" w:cs="Calibri"/>
+          <w:color w:val="1F1A1A"/>
+          <w:sz w:val="22"/>
+          <w:szCs w:val="22"/>
+        </w:rPr>
+        <w:t xml:space="preserve">en la consola después de guardarlo y coincide con </w:t>
       </w:r>
       <w:r>
         <w:rPr>
@@ -1029,27 +1083,7 @@
           <w:sz w:val="22"/>
           <w:szCs w:val="22"/>
         </w:rPr>
-        <w:t xml:space="preserve"> presionar "Publicar" en </w:t>
-      </w:r>
-      <w:r>
-        <w:rPr>
-          <w:rFonts w:ascii="Calibri" w:eastAsia="Times New Roman" w:hAnsi="Calibri" w:cs="Calibri"/>
-          <w:i/>
-          <w:iCs/>
-          <w:color w:val="1F1A1A"/>
-          <w:sz w:val="22"/>
-          <w:szCs w:val="22"/>
-        </w:rPr>
-        <w:t>Firestore → Reglas</w:t>
-      </w:r>
-      <w:r>
-        <w:rPr>
-          <w:rFonts w:ascii="Calibri" w:eastAsia="Times New Roman" w:hAnsi="Calibri" w:cs="Calibri"/>
-          <w:color w:val="1F1A1A"/>
-          <w:sz w:val="22"/>
-          <w:szCs w:val="22"/>
-        </w:rPr>
-        <w:t xml:space="preserve">, crear el índice de </w:t>
+        <w:t xml:space="preserve"> crear el índice de </w:t>
       </w:r>
       <w:r>
         <w:rPr>
@@ -1123,6 +1157,7 @@
         <w:rPr>
           <w:rFonts w:ascii="Calibri" w:eastAsia="Times New Roman" w:hAnsi="Calibri" w:cs="Calibri"/>
         </w:rPr>
+        <w:lastRenderedPageBreak/>
         <w:t>20-03. Primera versión de la web de Control Escolar y Enfermería (ADR-011)</w:t>
       </w:r>
     </w:p>
@@ -1184,7 +1219,6 @@
           <w:sz w:val="22"/>
           <w:szCs w:val="22"/>
         </w:rPr>
-        <w:lastRenderedPageBreak/>
         <w:t>Qué se hizo:</w:t>
       </w:r>
     </w:p>
@@ -1705,7 +1739,16 @@
           <w:sz w:val="22"/>
           <w:szCs w:val="22"/>
         </w:rPr>
-        <w:t xml:space="preserve"> carga cuentas y datos "Prueba".</w:t>
+        <w:t xml:space="preserve"> </w:t>
+      </w:r>
+      <w:r>
+        <w:rPr>
+          <w:rFonts w:ascii="Calibri" w:eastAsia="Times New Roman" w:hAnsi="Calibri" w:cs="Calibri"/>
+          <w:color w:val="1F1A1A"/>
+          <w:sz w:val="22"/>
+          <w:szCs w:val="22"/>
+        </w:rPr>
+        <w:t>carga cuentas y datos "Prueba".</w:t>
       </w:r>
     </w:p>
     <w:p>
@@ -2252,6 +2295,7 @@
           <w:sz w:val="22"/>
           <w:szCs w:val="22"/>
         </w:rPr>
+        <w:lastRenderedPageBreak/>
         <w:t>Qué se hizo:</w:t>
       </w:r>
       <w:r>
@@ -2301,17 +2345,7 @@
           <w:sz w:val="22"/>
           <w:szCs w:val="22"/>
         </w:rPr>
-        <w:t xml:space="preserve">: el escaneo sin señal se queda en "Guardando…" (A1), la hora la pone el teléfono (A2), un solo proyecto para pruebas y plantel (A3), el plan (A4), aviso de privacidad y Analytics (B1), custom claims (B2), App </w:t>
-      </w:r>
-      <w:r>
-        <w:rPr>
-          <w:rFonts w:ascii="Calibri" w:eastAsia="Times New Roman" w:hAnsi="Calibri" w:cs="Calibri"/>
-          <w:color w:val="1F1A1A"/>
-          <w:sz w:val="22"/>
-          <w:szCs w:val="22"/>
-        </w:rPr>
-        <w:lastRenderedPageBreak/>
-        <w:t xml:space="preserve">Check (B3), respaldos (B4), un script de administración con el Admin SDK para importar alumnos y crear cuentas (E1), GitHub Actions (D1) y sacar </w:t>
+        <w:t xml:space="preserve">: el escaneo sin señal se queda en "Guardando…" (A1), la hora la pone el teléfono (A2), un solo proyecto para pruebas y plantel (A3), el plan (A4), aviso de privacidad y Analytics (B1), custom claims (B2), App Check (B3), respaldos (B4), un script de administración con el Admin SDK para importar alumnos y crear cuentas (E1), GitHub Actions (D1) y sacar </w:t>
       </w:r>
       <w:r>
         <w:rPr>
@@ -4151,7 +4185,7 @@
           <w:sz w:val="22"/>
           <w:szCs w:val="22"/>
         </w:rPr>
-        <w:pict w14:anchorId="65DEB639">
+        <w:pict w14:anchorId="3F07263F">
           <v:rect id="_x0000_i1026" style="width:0;height:1.5pt" o:hralign="center" o:hrstd="t" o:hr="t" fillcolor="#a0a0a0" stroked="f"/>
         </w:pict>
       </w:r>
@@ -20452,7 +20486,7 @@
           <w:sz w:val="22"/>
           <w:szCs w:val="22"/>
         </w:rPr>
-        <w:pict w14:anchorId="2C0194C1">
+        <w:pict w14:anchorId="1053180E">
           <v:rect id="_x0000_i1027" style="width:0;height:1.5pt" o:hralign="center" o:hrstd="t" o:hr="t" fillcolor="#a0a0a0" stroked="f"/>
         </w:pict>
       </w:r>
@@ -21015,9 +21049,9 @@
 <file path=word/numbering.xml><?xml version="1.0" encoding="utf-8"?>
 <w:numbering xmlns:wpc="http://schemas.microsoft.com/office/word/2010/wordprocessingCanvas" xmlns:cx="http://schemas.microsoft.com/office/drawing/2014/chartex" xmlns:cx1="http://schemas.microsoft.com/office/drawing/2015/9/8/chartex" xmlns:cx2="http://schemas.microsoft.com/office/drawing/2015/10/21/chartex" xmlns:cx3="http://schemas.microsoft.com/office/drawing/2016/5/9/chartex" xmlns:cx4="http://schemas.microsoft.com/office/drawing/2016/5/10/chartex" xmlns:cx5="http://schemas.microsoft.com/office/drawing/2016/5/11/chartex" xmlns:cx6="http://schemas.microsoft.com/office/drawing/2016/5/12/chartex" xmlns:cx7="http://schemas.microsoft.com/office/drawing/2016/5/13/chartex" xmlns:cx8="http://schemas.microsoft.com/office/drawing/2016/5/14/chartex" xmlns:mc="http://schemas.openxmlformats.org/markup-compatibility/2006" xmlns:aink="http://schemas.microsoft.com/office/drawing/2016/ink" xmlns:am3d="http://schemas.microsoft.com/office/drawing/2017/model3d" xmlns:o="urn:schemas-microsoft-com:office:office" xmlns:oel="http://schemas.microsoft.com/office/2019/extlst" xmlns:r="http://schemas.openxmlformats.org/officeDocument/2006/relationships" xmlns:m="http://schemas.openxmlformats.org/officeDocument/2006/math" xmlns:v="urn:schemas-microsoft-com:vml" xmlns:wp14="http://schemas.microsoft.com/office/word/2010/wordprocessingDrawing" xmlns:wp="http://schemas.openxmlformats.org/drawingml/2006/wordprocessingDrawing" xmlns:w10="urn:schemas-microsoft-com:office:word" xmlns:w="http://schemas.openxmlformats.org/wordprocessingml/2006/main" xmlns:w14="http://schemas.microsoft.com/office/word/2010/wordml" xmlns:w15="http://schemas.microsoft.com/office/word/2012/wordml" xmlns:w16cex="http://schemas.microsoft.com/office/word/2018/wordml/cex" xmlns:w16cid="http://schemas.microsoft.com/office/word/2016/wordml/cid" xmlns:w16="http://schemas.microsoft.com/office/word/2018/wordml" xmlns:w16du="http://schemas.microsoft.com/office/word/2023/wordml/word16du" xmlns:w16sdtdh="http://schemas.microsoft.com/office/word/2020/wordml/sdtdatahash" xmlns:w16sdtfl="http://schemas.microsoft.com/office/word/2024/wordml/sdtformatlock" xmlns:w16se="http://schemas.microsoft.com/office/word/2015/wordml/symex" xmlns:wpg="http://schemas.microsoft.com/office/word/2010/wordprocessingGroup" xmlns:wpi="http://schemas.microsoft.com/office/word/2010/wordprocessingInk" xmlns:wne="http://schemas.microsoft.com/office/word/2006/wordml" xmlns:wps="http://schemas.microsoft.com/office/word/2010/wordprocessingShape" mc:Ignorable="w14 w15 w16se w16cid w16 w16cex w16sdtdh w16sdtfl w16du wp14">
   <w:abstractNum w:abstractNumId="0" w15:restartNumberingAfterBreak="0">
-    <w:nsid w:val="060635D0"/>
+    <w:nsid w:val="017E7DAB"/>
     <w:multiLevelType w:val="multilevel"/>
-    <w:tmpl w:val="4BD0CC9A"/>
+    <w:tmpl w:val="A3F0998E"/>
     <w:lvl w:ilvl="0">
       <w:start w:val="1"/>
       <w:numFmt w:val="bullet"/>
@@ -21164,9 +21198,9 @@
     </w:lvl>
   </w:abstractNum>
   <w:abstractNum w:abstractNumId="1" w15:restartNumberingAfterBreak="0">
-    <w:nsid w:val="074A4974"/>
+    <w:nsid w:val="05F247A9"/>
     <w:multiLevelType w:val="multilevel"/>
-    <w:tmpl w:val="36C23654"/>
+    <w:tmpl w:val="B492B480"/>
     <w:lvl w:ilvl="0">
       <w:start w:val="1"/>
       <w:numFmt w:val="bullet"/>
@@ -21313,9 +21347,9 @@
     </w:lvl>
   </w:abstractNum>
   <w:abstractNum w:abstractNumId="2" w15:restartNumberingAfterBreak="0">
-    <w:nsid w:val="07C71306"/>
+    <w:nsid w:val="06F8070E"/>
     <w:multiLevelType w:val="multilevel"/>
-    <w:tmpl w:val="DE5CFBFC"/>
+    <w:tmpl w:val="A3E04120"/>
     <w:lvl w:ilvl="0">
       <w:start w:val="1"/>
       <w:numFmt w:val="bullet"/>
@@ -21462,9 +21496,9 @@
     </w:lvl>
   </w:abstractNum>
   <w:abstractNum w:abstractNumId="3" w15:restartNumberingAfterBreak="0">
-    <w:nsid w:val="0A7844AB"/>
+    <w:nsid w:val="0797653B"/>
     <w:multiLevelType w:val="multilevel"/>
-    <w:tmpl w:val="38A8E896"/>
+    <w:tmpl w:val="AD981B90"/>
     <w:lvl w:ilvl="0">
       <w:start w:val="1"/>
       <w:numFmt w:val="bullet"/>
@@ -21481,10 +21515,10 @@
         <w:sz w:val="20"/>
       </w:rPr>
     </w:lvl>
-    <w:lvl w:ilvl="1" w:tentative="1">
-      <w:start w:val="1"/>
-      <w:numFmt w:val="bullet"/>
-      <w:lvlText w:val="o"/>
+    <w:lvl w:ilvl="1">
+      <w:start w:val="1"/>
+      <w:numFmt w:val="decimal"/>
+      <w:lvlText w:val="%2."/>
       <w:lvlJc w:val="left"/>
       <w:pPr>
         <w:tabs>
@@ -21492,10 +21526,6 @@
         </w:tabs>
         <w:ind w:left="1440" w:hanging="360"/>
       </w:pPr>
-      <w:rPr>
-        <w:rFonts w:ascii="Courier New" w:hAnsi="Courier New" w:hint="default"/>
-        <w:sz w:val="20"/>
-      </w:rPr>
     </w:lvl>
     <w:lvl w:ilvl="2" w:tentative="1">
       <w:start w:val="1"/>
@@ -21611,9 +21641,9 @@
     </w:lvl>
   </w:abstractNum>
   <w:abstractNum w:abstractNumId="4" w15:restartNumberingAfterBreak="0">
-    <w:nsid w:val="107B66B8"/>
+    <w:nsid w:val="08A00BFD"/>
     <w:multiLevelType w:val="multilevel"/>
-    <w:tmpl w:val="E11A57EA"/>
+    <w:tmpl w:val="3E78E0DA"/>
     <w:lvl w:ilvl="0">
       <w:start w:val="1"/>
       <w:numFmt w:val="bullet"/>
@@ -21630,7 +21660,7 @@
         <w:sz w:val="20"/>
       </w:rPr>
     </w:lvl>
-    <w:lvl w:ilvl="1">
+    <w:lvl w:ilvl="1" w:tentative="1">
       <w:start w:val="1"/>
       <w:numFmt w:val="bullet"/>
       <w:lvlText w:val="o"/>
@@ -21760,9 +21790,9 @@
     </w:lvl>
   </w:abstractNum>
   <w:abstractNum w:abstractNumId="5" w15:restartNumberingAfterBreak="0">
-    <w:nsid w:val="134205EA"/>
+    <w:nsid w:val="0EB974D0"/>
     <w:multiLevelType w:val="multilevel"/>
-    <w:tmpl w:val="FF40D5CE"/>
+    <w:tmpl w:val="5C441100"/>
     <w:lvl w:ilvl="0">
       <w:start w:val="1"/>
       <w:numFmt w:val="bullet"/>
@@ -21779,7 +21809,7 @@
         <w:sz w:val="20"/>
       </w:rPr>
     </w:lvl>
-    <w:lvl w:ilvl="1" w:tentative="1">
+    <w:lvl w:ilvl="1">
       <w:start w:val="1"/>
       <w:numFmt w:val="bullet"/>
       <w:lvlText w:val="o"/>
@@ -21909,9 +21939,9 @@
     </w:lvl>
   </w:abstractNum>
   <w:abstractNum w:abstractNumId="6" w15:restartNumberingAfterBreak="0">
-    <w:nsid w:val="135E3921"/>
+    <w:nsid w:val="10FF2743"/>
     <w:multiLevelType w:val="multilevel"/>
-    <w:tmpl w:val="F1D40EA2"/>
+    <w:tmpl w:val="FD96F22E"/>
     <w:lvl w:ilvl="0">
       <w:start w:val="1"/>
       <w:numFmt w:val="bullet"/>
@@ -21928,7 +21958,7 @@
         <w:sz w:val="20"/>
       </w:rPr>
     </w:lvl>
-    <w:lvl w:ilvl="1">
+    <w:lvl w:ilvl="1" w:tentative="1">
       <w:start w:val="1"/>
       <w:numFmt w:val="bullet"/>
       <w:lvlText w:val="o"/>
@@ -22058,9 +22088,9 @@
     </w:lvl>
   </w:abstractNum>
   <w:abstractNum w:abstractNumId="7" w15:restartNumberingAfterBreak="0">
-    <w:nsid w:val="150E0142"/>
+    <w:nsid w:val="11A767F5"/>
     <w:multiLevelType w:val="multilevel"/>
-    <w:tmpl w:val="F4BEA042"/>
+    <w:tmpl w:val="CC845B84"/>
     <w:lvl w:ilvl="0">
       <w:start w:val="1"/>
       <w:numFmt w:val="bullet"/>
@@ -22077,7 +22107,7 @@
         <w:sz w:val="20"/>
       </w:rPr>
     </w:lvl>
-    <w:lvl w:ilvl="1">
+    <w:lvl w:ilvl="1" w:tentative="1">
       <w:start w:val="1"/>
       <w:numFmt w:val="bullet"/>
       <w:lvlText w:val="o"/>
@@ -22207,9 +22237,9 @@
     </w:lvl>
   </w:abstractNum>
   <w:abstractNum w:abstractNumId="8" w15:restartNumberingAfterBreak="0">
-    <w:nsid w:val="15CE4374"/>
+    <w:nsid w:val="136668E2"/>
     <w:multiLevelType w:val="multilevel"/>
-    <w:tmpl w:val="D2C0AB5E"/>
+    <w:tmpl w:val="E1BEC874"/>
     <w:lvl w:ilvl="0">
       <w:start w:val="1"/>
       <w:numFmt w:val="bullet"/>
@@ -22356,9 +22386,9 @@
     </w:lvl>
   </w:abstractNum>
   <w:abstractNum w:abstractNumId="9" w15:restartNumberingAfterBreak="0">
-    <w:nsid w:val="1A3776B6"/>
+    <w:nsid w:val="15922A24"/>
     <w:multiLevelType w:val="multilevel"/>
-    <w:tmpl w:val="E1B69CC4"/>
+    <w:tmpl w:val="D1809A78"/>
     <w:lvl w:ilvl="0">
       <w:start w:val="1"/>
       <w:numFmt w:val="bullet"/>
@@ -22505,9 +22535,9 @@
     </w:lvl>
   </w:abstractNum>
   <w:abstractNum w:abstractNumId="10" w15:restartNumberingAfterBreak="0">
-    <w:nsid w:val="1DF6109D"/>
+    <w:nsid w:val="1B750A80"/>
     <w:multiLevelType w:val="multilevel"/>
-    <w:tmpl w:val="0EAAE552"/>
+    <w:tmpl w:val="1A0801D2"/>
     <w:lvl w:ilvl="0">
       <w:start w:val="1"/>
       <w:numFmt w:val="bullet"/>
@@ -22524,7 +22554,7 @@
         <w:sz w:val="20"/>
       </w:rPr>
     </w:lvl>
-    <w:lvl w:ilvl="1" w:tentative="1">
+    <w:lvl w:ilvl="1">
       <w:start w:val="1"/>
       <w:numFmt w:val="bullet"/>
       <w:lvlText w:val="o"/>
@@ -22654,9 +22684,9 @@
     </w:lvl>
   </w:abstractNum>
   <w:abstractNum w:abstractNumId="11" w15:restartNumberingAfterBreak="0">
-    <w:nsid w:val="1F9D762A"/>
+    <w:nsid w:val="200E6E8B"/>
     <w:multiLevelType w:val="multilevel"/>
-    <w:tmpl w:val="E3BC4D5C"/>
+    <w:tmpl w:val="455417E8"/>
     <w:lvl w:ilvl="0">
       <w:start w:val="1"/>
       <w:numFmt w:val="bullet"/>
@@ -22803,9 +22833,9 @@
     </w:lvl>
   </w:abstractNum>
   <w:abstractNum w:abstractNumId="12" w15:restartNumberingAfterBreak="0">
-    <w:nsid w:val="235776F0"/>
+    <w:nsid w:val="23121600"/>
     <w:multiLevelType w:val="multilevel"/>
-    <w:tmpl w:val="58180F5E"/>
+    <w:tmpl w:val="80F00002"/>
     <w:lvl w:ilvl="0">
       <w:start w:val="1"/>
       <w:numFmt w:val="bullet"/>
@@ -22822,7 +22852,7 @@
         <w:sz w:val="20"/>
       </w:rPr>
     </w:lvl>
-    <w:lvl w:ilvl="1">
+    <w:lvl w:ilvl="1" w:tentative="1">
       <w:start w:val="1"/>
       <w:numFmt w:val="bullet"/>
       <w:lvlText w:val="o"/>
@@ -22952,9 +22982,9 @@
     </w:lvl>
   </w:abstractNum>
   <w:abstractNum w:abstractNumId="13" w15:restartNumberingAfterBreak="0">
-    <w:nsid w:val="25EE6007"/>
+    <w:nsid w:val="2363527C"/>
     <w:multiLevelType w:val="multilevel"/>
-    <w:tmpl w:val="78D29B6A"/>
+    <w:tmpl w:val="58901592"/>
     <w:lvl w:ilvl="0">
       <w:start w:val="1"/>
       <w:numFmt w:val="bullet"/>
@@ -23101,9 +23131,9 @@
     </w:lvl>
   </w:abstractNum>
   <w:abstractNum w:abstractNumId="14" w15:restartNumberingAfterBreak="0">
-    <w:nsid w:val="27D13338"/>
+    <w:nsid w:val="25E214B4"/>
     <w:multiLevelType w:val="multilevel"/>
-    <w:tmpl w:val="2EEA36F0"/>
+    <w:tmpl w:val="CB946F38"/>
     <w:lvl w:ilvl="0">
       <w:start w:val="1"/>
       <w:numFmt w:val="bullet"/>
@@ -23120,7 +23150,7 @@
         <w:sz w:val="20"/>
       </w:rPr>
     </w:lvl>
-    <w:lvl w:ilvl="1" w:tentative="1">
+    <w:lvl w:ilvl="1">
       <w:start w:val="1"/>
       <w:numFmt w:val="bullet"/>
       <w:lvlText w:val="o"/>
@@ -23250,9 +23280,9 @@
     </w:lvl>
   </w:abstractNum>
   <w:abstractNum w:abstractNumId="15" w15:restartNumberingAfterBreak="0">
-    <w:nsid w:val="2BC97D10"/>
+    <w:nsid w:val="263C02E6"/>
     <w:multiLevelType w:val="multilevel"/>
-    <w:tmpl w:val="3B406978"/>
+    <w:tmpl w:val="B970A80C"/>
     <w:lvl w:ilvl="0">
       <w:start w:val="1"/>
       <w:numFmt w:val="bullet"/>
@@ -23399,9 +23429,9 @@
     </w:lvl>
   </w:abstractNum>
   <w:abstractNum w:abstractNumId="16" w15:restartNumberingAfterBreak="0">
-    <w:nsid w:val="2EA11A13"/>
+    <w:nsid w:val="2B023282"/>
     <w:multiLevelType w:val="multilevel"/>
-    <w:tmpl w:val="DEFCE516"/>
+    <w:tmpl w:val="D572376A"/>
     <w:lvl w:ilvl="0">
       <w:start w:val="1"/>
       <w:numFmt w:val="bullet"/>
@@ -23418,7 +23448,7 @@
         <w:sz w:val="20"/>
       </w:rPr>
     </w:lvl>
-    <w:lvl w:ilvl="1" w:tentative="1">
+    <w:lvl w:ilvl="1">
       <w:start w:val="1"/>
       <w:numFmt w:val="bullet"/>
       <w:lvlText w:val="o"/>
@@ -23548,9 +23578,9 @@
     </w:lvl>
   </w:abstractNum>
   <w:abstractNum w:abstractNumId="17" w15:restartNumberingAfterBreak="0">
-    <w:nsid w:val="2FA92889"/>
+    <w:nsid w:val="32720A78"/>
     <w:multiLevelType w:val="multilevel"/>
-    <w:tmpl w:val="8332AF36"/>
+    <w:tmpl w:val="810C22BC"/>
     <w:lvl w:ilvl="0">
       <w:start w:val="1"/>
       <w:numFmt w:val="bullet"/>
@@ -23567,7 +23597,7 @@
         <w:sz w:val="20"/>
       </w:rPr>
     </w:lvl>
-    <w:lvl w:ilvl="1" w:tentative="1">
+    <w:lvl w:ilvl="1">
       <w:start w:val="1"/>
       <w:numFmt w:val="bullet"/>
       <w:lvlText w:val="o"/>
@@ -23697,9 +23727,9 @@
     </w:lvl>
   </w:abstractNum>
   <w:abstractNum w:abstractNumId="18" w15:restartNumberingAfterBreak="0">
-    <w:nsid w:val="3174724B"/>
+    <w:nsid w:val="3639629C"/>
     <w:multiLevelType w:val="multilevel"/>
-    <w:tmpl w:val="F56AA9FA"/>
+    <w:tmpl w:val="85AC9DEA"/>
     <w:lvl w:ilvl="0">
       <w:start w:val="1"/>
       <w:numFmt w:val="bullet"/>
@@ -23846,9 +23876,9 @@
     </w:lvl>
   </w:abstractNum>
   <w:abstractNum w:abstractNumId="19" w15:restartNumberingAfterBreak="0">
-    <w:nsid w:val="34F9788A"/>
+    <w:nsid w:val="3B22460B"/>
     <w:multiLevelType w:val="multilevel"/>
-    <w:tmpl w:val="5224C6E4"/>
+    <w:tmpl w:val="B97C6F6E"/>
     <w:lvl w:ilvl="0">
       <w:start w:val="1"/>
       <w:numFmt w:val="bullet"/>
@@ -23865,7 +23895,7 @@
         <w:sz w:val="20"/>
       </w:rPr>
     </w:lvl>
-    <w:lvl w:ilvl="1">
+    <w:lvl w:ilvl="1" w:tentative="1">
       <w:start w:val="1"/>
       <w:numFmt w:val="bullet"/>
       <w:lvlText w:val="o"/>
@@ -23995,9 +24025,9 @@
     </w:lvl>
   </w:abstractNum>
   <w:abstractNum w:abstractNumId="20" w15:restartNumberingAfterBreak="0">
-    <w:nsid w:val="36F76052"/>
+    <w:nsid w:val="3B905649"/>
     <w:multiLevelType w:val="multilevel"/>
-    <w:tmpl w:val="DA70B27E"/>
+    <w:tmpl w:val="E0E0AEE4"/>
     <w:lvl w:ilvl="0">
       <w:start w:val="1"/>
       <w:numFmt w:val="bullet"/>
@@ -24144,9 +24174,9 @@
     </w:lvl>
   </w:abstractNum>
   <w:abstractNum w:abstractNumId="21" w15:restartNumberingAfterBreak="0">
-    <w:nsid w:val="3989072B"/>
+    <w:nsid w:val="3FA73C9A"/>
     <w:multiLevelType w:val="multilevel"/>
-    <w:tmpl w:val="39EA1F76"/>
+    <w:tmpl w:val="5978E95A"/>
     <w:lvl w:ilvl="0">
       <w:start w:val="1"/>
       <w:numFmt w:val="bullet"/>
@@ -24163,7 +24193,7 @@
         <w:sz w:val="20"/>
       </w:rPr>
     </w:lvl>
-    <w:lvl w:ilvl="1">
+    <w:lvl w:ilvl="1" w:tentative="1">
       <w:start w:val="1"/>
       <w:numFmt w:val="bullet"/>
       <w:lvlText w:val="o"/>
@@ -24293,9 +24323,9 @@
     </w:lvl>
   </w:abstractNum>
   <w:abstractNum w:abstractNumId="22" w15:restartNumberingAfterBreak="0">
-    <w:nsid w:val="3ABE466F"/>
+    <w:nsid w:val="44F40BE1"/>
     <w:multiLevelType w:val="multilevel"/>
-    <w:tmpl w:val="BB006558"/>
+    <w:tmpl w:val="B8F05F4C"/>
     <w:lvl w:ilvl="0">
       <w:start w:val="1"/>
       <w:numFmt w:val="bullet"/>
@@ -24442,9 +24472,9 @@
     </w:lvl>
   </w:abstractNum>
   <w:abstractNum w:abstractNumId="23" w15:restartNumberingAfterBreak="0">
-    <w:nsid w:val="3BDF0BA7"/>
+    <w:nsid w:val="485C441D"/>
     <w:multiLevelType w:val="multilevel"/>
-    <w:tmpl w:val="63D07802"/>
+    <w:tmpl w:val="BC28C09A"/>
     <w:lvl w:ilvl="0">
       <w:start w:val="1"/>
       <w:numFmt w:val="bullet"/>
@@ -24461,7 +24491,7 @@
         <w:sz w:val="20"/>
       </w:rPr>
     </w:lvl>
-    <w:lvl w:ilvl="1" w:tentative="1">
+    <w:lvl w:ilvl="1">
       <w:start w:val="1"/>
       <w:numFmt w:val="bullet"/>
       <w:lvlText w:val="o"/>
@@ -24591,9 +24621,9 @@
     </w:lvl>
   </w:abstractNum>
   <w:abstractNum w:abstractNumId="24" w15:restartNumberingAfterBreak="0">
-    <w:nsid w:val="3C110848"/>
+    <w:nsid w:val="4E740A29"/>
     <w:multiLevelType w:val="multilevel"/>
-    <w:tmpl w:val="D908C2DC"/>
+    <w:tmpl w:val="EB26A89C"/>
     <w:lvl w:ilvl="0">
       <w:start w:val="1"/>
       <w:numFmt w:val="bullet"/>
@@ -24610,7 +24640,7 @@
         <w:sz w:val="20"/>
       </w:rPr>
     </w:lvl>
-    <w:lvl w:ilvl="1">
+    <w:lvl w:ilvl="1" w:tentative="1">
       <w:start w:val="1"/>
       <w:numFmt w:val="bullet"/>
       <w:lvlText w:val="o"/>
@@ -24626,7 +24656,7 @@
         <w:sz w:val="20"/>
       </w:rPr>
     </w:lvl>
-    <w:lvl w:ilvl="2">
+    <w:lvl w:ilvl="2" w:tentative="1">
       <w:start w:val="1"/>
       <w:numFmt w:val="bullet"/>
       <w:lvlText w:val=""/>
@@ -24740,9 +24770,9 @@
     </w:lvl>
   </w:abstractNum>
   <w:abstractNum w:abstractNumId="25" w15:restartNumberingAfterBreak="0">
-    <w:nsid w:val="3D1168F5"/>
+    <w:nsid w:val="56A71203"/>
     <w:multiLevelType w:val="multilevel"/>
-    <w:tmpl w:val="9EEC7168"/>
+    <w:tmpl w:val="69BA617A"/>
     <w:lvl w:ilvl="0">
       <w:start w:val="1"/>
       <w:numFmt w:val="bullet"/>
@@ -24889,9 +24919,9 @@
     </w:lvl>
   </w:abstractNum>
   <w:abstractNum w:abstractNumId="26" w15:restartNumberingAfterBreak="0">
-    <w:nsid w:val="3D906E89"/>
+    <w:nsid w:val="5BDA1011"/>
     <w:multiLevelType w:val="multilevel"/>
-    <w:tmpl w:val="AEBE359C"/>
+    <w:tmpl w:val="1814019E"/>
     <w:lvl w:ilvl="0">
       <w:start w:val="1"/>
       <w:numFmt w:val="bullet"/>
@@ -24908,10 +24938,10 @@
         <w:sz w:val="20"/>
       </w:rPr>
     </w:lvl>
-    <w:lvl w:ilvl="1">
-      <w:start w:val="1"/>
-      <w:numFmt w:val="decimal"/>
-      <w:lvlText w:val="%2."/>
+    <w:lvl w:ilvl="1" w:tentative="1">
+      <w:start w:val="1"/>
+      <w:numFmt w:val="bullet"/>
+      <w:lvlText w:val="o"/>
       <w:lvlJc w:val="left"/>
       <w:pPr>
         <w:tabs>
@@ -24919,6 +24949,10 @@
         </w:tabs>
         <w:ind w:left="1440" w:hanging="360"/>
       </w:pPr>
+      <w:rPr>
+        <w:rFonts w:ascii="Courier New" w:hAnsi="Courier New" w:hint="default"/>
+        <w:sz w:val="20"/>
+      </w:rPr>
     </w:lvl>
     <w:lvl w:ilvl="2" w:tentative="1">
       <w:start w:val="1"/>
@@ -25034,9 +25068,9 @@
     </w:lvl>
   </w:abstractNum>
   <w:abstractNum w:abstractNumId="27" w15:restartNumberingAfterBreak="0">
-    <w:nsid w:val="484F4FF9"/>
+    <w:nsid w:val="608D463F"/>
     <w:multiLevelType w:val="multilevel"/>
-    <w:tmpl w:val="7D26B11C"/>
+    <w:tmpl w:val="2C26F92C"/>
     <w:lvl w:ilvl="0">
       <w:start w:val="1"/>
       <w:numFmt w:val="bullet"/>
@@ -25183,9 +25217,9 @@
     </w:lvl>
   </w:abstractNum>
   <w:abstractNum w:abstractNumId="28" w15:restartNumberingAfterBreak="0">
-    <w:nsid w:val="49904FCE"/>
+    <w:nsid w:val="635911EB"/>
     <w:multiLevelType w:val="multilevel"/>
-    <w:tmpl w:val="D29089AC"/>
+    <w:tmpl w:val="56046EE0"/>
     <w:lvl w:ilvl="0">
       <w:start w:val="1"/>
       <w:numFmt w:val="bullet"/>
@@ -25202,7 +25236,7 @@
         <w:sz w:val="20"/>
       </w:rPr>
     </w:lvl>
-    <w:lvl w:ilvl="1">
+    <w:lvl w:ilvl="1" w:tentative="1">
       <w:start w:val="1"/>
       <w:numFmt w:val="bullet"/>
       <w:lvlText w:val="o"/>
@@ -25332,9 +25366,9 @@
     </w:lvl>
   </w:abstractNum>
   <w:abstractNum w:abstractNumId="29" w15:restartNumberingAfterBreak="0">
-    <w:nsid w:val="4CB61828"/>
+    <w:nsid w:val="639C126E"/>
     <w:multiLevelType w:val="multilevel"/>
-    <w:tmpl w:val="B7002EE8"/>
+    <w:tmpl w:val="95A20938"/>
     <w:lvl w:ilvl="0">
       <w:start w:val="1"/>
       <w:numFmt w:val="bullet"/>
@@ -25481,9 +25515,9 @@
     </w:lvl>
   </w:abstractNum>
   <w:abstractNum w:abstractNumId="30" w15:restartNumberingAfterBreak="0">
-    <w:nsid w:val="50644629"/>
+    <w:nsid w:val="6D1A3F8B"/>
     <w:multiLevelType w:val="multilevel"/>
-    <w:tmpl w:val="B70E27B2"/>
+    <w:tmpl w:val="EE248634"/>
     <w:lvl w:ilvl="0">
       <w:start w:val="1"/>
       <w:numFmt w:val="bullet"/>
@@ -25630,9 +25664,9 @@
     </w:lvl>
   </w:abstractNum>
   <w:abstractNum w:abstractNumId="31" w15:restartNumberingAfterBreak="0">
-    <w:nsid w:val="5C37643C"/>
+    <w:nsid w:val="6DBE5197"/>
     <w:multiLevelType w:val="multilevel"/>
-    <w:tmpl w:val="54604B32"/>
+    <w:tmpl w:val="B2003DAE"/>
     <w:lvl w:ilvl="0">
       <w:start w:val="1"/>
       <w:numFmt w:val="bullet"/>
@@ -25649,7 +25683,7 @@
         <w:sz w:val="20"/>
       </w:rPr>
     </w:lvl>
-    <w:lvl w:ilvl="1" w:tentative="1">
+    <w:lvl w:ilvl="1">
       <w:start w:val="1"/>
       <w:numFmt w:val="bullet"/>
       <w:lvlText w:val="o"/>
@@ -25779,9 +25813,9 @@
     </w:lvl>
   </w:abstractNum>
   <w:abstractNum w:abstractNumId="32" w15:restartNumberingAfterBreak="0">
-    <w:nsid w:val="632A1669"/>
+    <w:nsid w:val="70147E3C"/>
     <w:multiLevelType w:val="multilevel"/>
-    <w:tmpl w:val="E9529F72"/>
+    <w:tmpl w:val="1B8660A8"/>
     <w:lvl w:ilvl="0">
       <w:start w:val="1"/>
       <w:numFmt w:val="bullet"/>
@@ -25928,9 +25962,9 @@
     </w:lvl>
   </w:abstractNum>
   <w:abstractNum w:abstractNumId="33" w15:restartNumberingAfterBreak="0">
-    <w:nsid w:val="64F848E7"/>
+    <w:nsid w:val="7043067F"/>
     <w:multiLevelType w:val="multilevel"/>
-    <w:tmpl w:val="24F096FA"/>
+    <w:tmpl w:val="D9948124"/>
     <w:lvl w:ilvl="0">
       <w:start w:val="1"/>
       <w:numFmt w:val="bullet"/>
@@ -25963,7 +25997,7 @@
         <w:sz w:val="20"/>
       </w:rPr>
     </w:lvl>
-    <w:lvl w:ilvl="2" w:tentative="1">
+    <w:lvl w:ilvl="2">
       <w:start w:val="1"/>
       <w:numFmt w:val="bullet"/>
       <w:lvlText w:val=""/>
@@ -26077,9 +26111,9 @@
     </w:lvl>
   </w:abstractNum>
   <w:abstractNum w:abstractNumId="34" w15:restartNumberingAfterBreak="0">
-    <w:nsid w:val="65E67258"/>
+    <w:nsid w:val="709F507F"/>
     <w:multiLevelType w:val="multilevel"/>
-    <w:tmpl w:val="E788D942"/>
+    <w:tmpl w:val="9D22C672"/>
     <w:lvl w:ilvl="0">
       <w:start w:val="1"/>
       <w:numFmt w:val="bullet"/>
@@ -26096,7 +26130,7 @@
         <w:sz w:val="20"/>
       </w:rPr>
     </w:lvl>
-    <w:lvl w:ilvl="1">
+    <w:lvl w:ilvl="1" w:tentative="1">
       <w:start w:val="1"/>
       <w:numFmt w:val="bullet"/>
       <w:lvlText w:val="o"/>
@@ -26226,9 +26260,9 @@
     </w:lvl>
   </w:abstractNum>
   <w:abstractNum w:abstractNumId="35" w15:restartNumberingAfterBreak="0">
-    <w:nsid w:val="730017A4"/>
+    <w:nsid w:val="75161E6B"/>
     <w:multiLevelType w:val="multilevel"/>
-    <w:tmpl w:val="589CD1C2"/>
+    <w:tmpl w:val="67AA676C"/>
     <w:lvl w:ilvl="0">
       <w:start w:val="1"/>
       <w:numFmt w:val="bullet"/>
@@ -26245,7 +26279,7 @@
         <w:sz w:val="20"/>
       </w:rPr>
     </w:lvl>
-    <w:lvl w:ilvl="1" w:tentative="1">
+    <w:lvl w:ilvl="1">
       <w:start w:val="1"/>
       <w:numFmt w:val="bullet"/>
       <w:lvlText w:val="o"/>
@@ -26375,9 +26409,9 @@
     </w:lvl>
   </w:abstractNum>
   <w:abstractNum w:abstractNumId="36" w15:restartNumberingAfterBreak="0">
-    <w:nsid w:val="779E4D68"/>
+    <w:nsid w:val="77FB2103"/>
     <w:multiLevelType w:val="multilevel"/>
-    <w:tmpl w:val="A9FCCA32"/>
+    <w:tmpl w:val="608C3794"/>
     <w:lvl w:ilvl="0">
       <w:start w:val="1"/>
       <w:numFmt w:val="bullet"/>
@@ -26524,9 +26558,9 @@
     </w:lvl>
   </w:abstractNum>
   <w:abstractNum w:abstractNumId="37" w15:restartNumberingAfterBreak="0">
-    <w:nsid w:val="77CA3F7B"/>
+    <w:nsid w:val="78AB1145"/>
     <w:multiLevelType w:val="multilevel"/>
-    <w:tmpl w:val="1258F7A6"/>
+    <w:tmpl w:val="8EE445A0"/>
     <w:lvl w:ilvl="0">
       <w:start w:val="1"/>
       <w:numFmt w:val="bullet"/>
@@ -26543,7 +26577,7 @@
         <w:sz w:val="20"/>
       </w:rPr>
     </w:lvl>
-    <w:lvl w:ilvl="1" w:tentative="1">
+    <w:lvl w:ilvl="1">
       <w:start w:val="1"/>
       <w:numFmt w:val="bullet"/>
       <w:lvlText w:val="o"/>
@@ -26673,9 +26707,9 @@
     </w:lvl>
   </w:abstractNum>
   <w:abstractNum w:abstractNumId="38" w15:restartNumberingAfterBreak="0">
-    <w:nsid w:val="790921A6"/>
+    <w:nsid w:val="78E005CE"/>
     <w:multiLevelType w:val="multilevel"/>
-    <w:tmpl w:val="10804B46"/>
+    <w:tmpl w:val="B4CA56EE"/>
     <w:lvl w:ilvl="0">
       <w:start w:val="1"/>
       <w:numFmt w:val="bullet"/>
@@ -26821,74 +26855,74 @@
       </w:rPr>
     </w:lvl>
   </w:abstractNum>
-  <w:num w:numId="1" w16cid:durableId="2011442906">
-    <w:abstractNumId w:val="24"/>
+  <w:num w:numId="1" w16cid:durableId="1692225372">
+    <w:abstractNumId w:val="33"/>
   </w:num>
-  <w:num w:numId="2" w16cid:durableId="444806942">
-    <w:abstractNumId w:val="4"/>
+  <w:num w:numId="2" w16cid:durableId="1752123340">
+    <w:abstractNumId w:val="17"/>
   </w:num>
-  <w:num w:numId="3" w16cid:durableId="965743784">
-    <w:abstractNumId w:val="18"/>
+  <w:num w:numId="3" w16cid:durableId="819350573">
+    <w:abstractNumId w:val="9"/>
   </w:num>
-  <w:num w:numId="4" w16cid:durableId="2097749611">
-    <w:abstractNumId w:val="12"/>
+  <w:num w:numId="4" w16cid:durableId="1079057703">
+    <w:abstractNumId w:val="5"/>
   </w:num>
-  <w:num w:numId="5" w16cid:durableId="1353415044">
+  <w:num w:numId="5" w16cid:durableId="661734290">
+    <w:abstractNumId w:val="15"/>
+  </w:num>
+  <w:num w:numId="6" w16cid:durableId="1315061697">
+    <w:abstractNumId w:val="31"/>
+  </w:num>
+  <w:num w:numId="7" w16cid:durableId="799346157">
+    <w:abstractNumId w:val="11"/>
+  </w:num>
+  <w:num w:numId="8" w16cid:durableId="1312559875">
+    <w:abstractNumId w:val="27"/>
+  </w:num>
+  <w:num w:numId="9" w16cid:durableId="425613498">
+    <w:abstractNumId w:val="10"/>
+  </w:num>
+  <w:num w:numId="10" w16cid:durableId="858736951">
+    <w:abstractNumId w:val="6"/>
+  </w:num>
+  <w:num w:numId="11" w16cid:durableId="570698677">
     <w:abstractNumId w:val="7"/>
   </w:num>
-  <w:num w:numId="6" w16cid:durableId="1348294865">
-    <w:abstractNumId w:val="6"/>
+  <w:num w:numId="12" w16cid:durableId="1199926098">
+    <w:abstractNumId w:val="34"/>
   </w:num>
-  <w:num w:numId="7" w16cid:durableId="1602907608">
-    <w:abstractNumId w:val="1"/>
+  <w:num w:numId="13" w16cid:durableId="1074203130">
+    <w:abstractNumId w:val="36"/>
   </w:num>
-  <w:num w:numId="8" w16cid:durableId="755784591">
+  <w:num w:numId="14" w16cid:durableId="42140183">
+    <w:abstractNumId w:val="35"/>
+  </w:num>
+  <w:num w:numId="15" w16cid:durableId="192157446">
+    <w:abstractNumId w:val="29"/>
+  </w:num>
+  <w:num w:numId="16" w16cid:durableId="76025419">
     <w:abstractNumId w:val="30"/>
   </w:num>
-  <w:num w:numId="9" w16cid:durableId="2097821837">
-    <w:abstractNumId w:val="28"/>
-  </w:num>
-  <w:num w:numId="10" w16cid:durableId="429735712">
-    <w:abstractNumId w:val="16"/>
-  </w:num>
-  <w:num w:numId="11" w16cid:durableId="861741489">
+  <w:num w:numId="17" w16cid:durableId="1298099769">
     <w:abstractNumId w:val="37"/>
   </w:num>
-  <w:num w:numId="12" w16cid:durableId="677659442">
-    <w:abstractNumId w:val="17"/>
+  <w:num w:numId="18" w16cid:durableId="782580150">
+    <w:abstractNumId w:val="22"/>
   </w:num>
-  <w:num w:numId="13" w16cid:durableId="65879340">
+  <w:num w:numId="19" w16cid:durableId="672536752">
+    <w:abstractNumId w:val="23"/>
+  </w:num>
+  <w:num w:numId="20" w16cid:durableId="1328629915">
+    <w:abstractNumId w:val="21"/>
+  </w:num>
+  <w:num w:numId="21" w16cid:durableId="516385945">
     <w:abstractNumId w:val="14"/>
   </w:num>
-  <w:num w:numId="14" w16cid:durableId="387611251">
-    <w:abstractNumId w:val="38"/>
+  <w:num w:numId="22" w16cid:durableId="1612323275">
+    <w:abstractNumId w:val="3"/>
   </w:num>
-  <w:num w:numId="15" w16cid:durableId="1162893517">
-    <w:abstractNumId w:val="33"/>
-  </w:num>
-  <w:num w:numId="16" w16cid:durableId="940526594">
-    <w:abstractNumId w:val="36"/>
-  </w:num>
-  <w:num w:numId="17" w16cid:durableId="1489323648">
-    <w:abstractNumId w:val="15"/>
-  </w:num>
-  <w:num w:numId="18" w16cid:durableId="1540581985">
-    <w:abstractNumId w:val="35"/>
-  </w:num>
-  <w:num w:numId="19" w16cid:durableId="2110658150">
-    <w:abstractNumId w:val="29"/>
-  </w:num>
-  <w:num w:numId="20" w16cid:durableId="1680162502">
-    <w:abstractNumId w:val="0"/>
-  </w:num>
-  <w:num w:numId="21" w16cid:durableId="500855603">
-    <w:abstractNumId w:val="34"/>
-  </w:num>
-  <w:num w:numId="22" w16cid:durableId="347803157">
-    <w:abstractNumId w:val="26"/>
-  </w:num>
-  <w:num w:numId="23" w16cid:durableId="809588923">
-    <w:abstractNumId w:val="26"/>
+  <w:num w:numId="23" w16cid:durableId="712120027">
+    <w:abstractNumId w:val="3"/>
     <w:lvlOverride w:ilvl="1">
       <w:lvl w:ilvl="1">
         <w:numFmt w:val="bullet"/>
@@ -26907,56 +26941,56 @@
       </w:lvl>
     </w:lvlOverride>
   </w:num>
-  <w:num w:numId="24" w16cid:durableId="802188453">
-    <w:abstractNumId w:val="22"/>
+  <w:num w:numId="24" w16cid:durableId="1441144572">
+    <w:abstractNumId w:val="8"/>
   </w:num>
-  <w:num w:numId="25" w16cid:durableId="1497376739">
+  <w:num w:numId="25" w16cid:durableId="1409380389">
+    <w:abstractNumId w:val="32"/>
+  </w:num>
+  <w:num w:numId="26" w16cid:durableId="1989823378">
+    <w:abstractNumId w:val="2"/>
+  </w:num>
+  <w:num w:numId="27" w16cid:durableId="96953599">
+    <w:abstractNumId w:val="28"/>
+  </w:num>
+  <w:num w:numId="28" w16cid:durableId="65887359">
+    <w:abstractNumId w:val="25"/>
+  </w:num>
+  <w:num w:numId="29" w16cid:durableId="533346223">
+    <w:abstractNumId w:val="16"/>
+  </w:num>
+  <w:num w:numId="30" w16cid:durableId="730076358">
+    <w:abstractNumId w:val="0"/>
+  </w:num>
+  <w:num w:numId="31" w16cid:durableId="1708988294">
+    <w:abstractNumId w:val="13"/>
+  </w:num>
+  <w:num w:numId="32" w16cid:durableId="1328050006">
+    <w:abstractNumId w:val="12"/>
+  </w:num>
+  <w:num w:numId="33" w16cid:durableId="181943535">
+    <w:abstractNumId w:val="1"/>
+  </w:num>
+  <w:num w:numId="34" w16cid:durableId="1758793349">
+    <w:abstractNumId w:val="24"/>
+  </w:num>
+  <w:num w:numId="35" w16cid:durableId="1177765975">
+    <w:abstractNumId w:val="18"/>
+  </w:num>
+  <w:num w:numId="36" w16cid:durableId="1044329417">
+    <w:abstractNumId w:val="38"/>
+  </w:num>
+  <w:num w:numId="37" w16cid:durableId="1058626710">
+    <w:abstractNumId w:val="26"/>
+  </w:num>
+  <w:num w:numId="38" w16cid:durableId="1773283628">
+    <w:abstractNumId w:val="20"/>
+  </w:num>
+  <w:num w:numId="39" w16cid:durableId="953901078">
     <w:abstractNumId w:val="19"/>
   </w:num>
-  <w:num w:numId="26" w16cid:durableId="468284575">
-    <w:abstractNumId w:val="31"/>
-  </w:num>
-  <w:num w:numId="27" w16cid:durableId="2080976176">
-    <w:abstractNumId w:val="20"/>
-  </w:num>
-  <w:num w:numId="28" w16cid:durableId="228610921">
-    <w:abstractNumId w:val="25"/>
-  </w:num>
-  <w:num w:numId="29" w16cid:durableId="686566796">
-    <w:abstractNumId w:val="21"/>
-  </w:num>
-  <w:num w:numId="30" w16cid:durableId="1869175870">
-    <w:abstractNumId w:val="8"/>
-  </w:num>
-  <w:num w:numId="31" w16cid:durableId="2020034267">
-    <w:abstractNumId w:val="5"/>
-  </w:num>
-  <w:num w:numId="32" w16cid:durableId="1118375446">
-    <w:abstractNumId w:val="3"/>
-  </w:num>
-  <w:num w:numId="33" w16cid:durableId="1443458656">
-    <w:abstractNumId w:val="13"/>
-  </w:num>
-  <w:num w:numId="34" w16cid:durableId="160241411">
-    <w:abstractNumId w:val="11"/>
-  </w:num>
-  <w:num w:numId="35" w16cid:durableId="1384869193">
-    <w:abstractNumId w:val="2"/>
-  </w:num>
-  <w:num w:numId="36" w16cid:durableId="1144081060">
-    <w:abstractNumId w:val="32"/>
-  </w:num>
-  <w:num w:numId="37" w16cid:durableId="340471551">
-    <w:abstractNumId w:val="27"/>
-  </w:num>
-  <w:num w:numId="38" w16cid:durableId="119303556">
-    <w:abstractNumId w:val="10"/>
-  </w:num>
-  <w:num w:numId="39" w16cid:durableId="967274694">
-    <w:abstractNumId w:val="23"/>
-  </w:num>
-  <w:num w:numId="40" w16cid:durableId="1409230232">
-    <w:abstractNumId w:val="9"/>
+  <w:num w:numId="40" w16cid:durableId="1215507222">
+    <w:abstractNumId w:val="4"/>
   </w:num>
 </w:numbering>
 </file>

</xml_diff>